<commit_message>
docs: paper cites its Zenodo DOI and the KherveTools project
Author details, teaching use and the software family were the last
gaps the user could answer; the cover letter now carries them too.

Co-Authored-By: Claude Opus 5.5 <noreply@anthropic.com>
</commit_message>
<xml_diff>
--- a/paper/SoftwareX_Cover_Letter.docx
+++ b/paper/SoftwareX_Cover_Letter.docx
@@ -79,7 +79,21 @@
           <w:sz-cs w:val="29"/>
           <w:spacing w:val="0"/>
         </w:rPr>
-        <w:t xml:space="preserve">The software also exposes its editing operations through the Model Context Protocol, which lets an AI assistant build a model, look at a render of it, measure it and check it for 3D printing before handing it back. Most published work on text-to-CAD evaluates code generated once and then compiled; KherveCAD makes it possible to study and use the whole loop of building, checking and correcting. I believe SoftwareX is the right journal to reach researchers who build their own equipment and those working on AI-assisted design. The source code, installers for Windows and macOS, and documentation are available at https://github.com/gkerherve/KherveCAD.</w:t>
+        <w:t xml:space="preserve">The software also exposes its editing operations through the Model Context Protocol, which lets an AI assistant build a model, look at a render of it, measure it and check it for 3D printing before handing it back. Most published work on text-to-CAD evaluates code generated once and then compiled; KherveCAD makes it possible to study and use the whole loop of building, checking and correcting. I believe SoftwareX is the right journal to reach researchers who build their own equipment and those working on AI-assisted design. The source code, installers for Windows and macOS, and documentation are available at https://github.com/gkerherve/KherveCAD, and the release described is archived on Zenodo (https://doi.org/10.5281/zenodo.23305286).</w:t>
+      </w:r>
+    </w:p>
+    <w:p>
+      <w:pPr>
+        <w:spacing w:after="293"/>
+      </w:pPr>
+      <w:r>
+        <w:rPr>
+          <w:rFonts w:ascii="Times" w:hAnsi="Times" w:cs="Times"/>
+          <w:sz w:val="29"/>
+          <w:sz-cs w:val="29"/>
+          <w:spacing w:val="0"/>
+        </w:rPr>
+        <w:t xml:space="preserve">KherveCAD is part of KherveTools (https://khervetools.com), a family of free, open-source applications I develop for scientists. The first of them, KherveFitting (Surface and Interface Analysis, https://doi.org/10.1002/sia.70032), is now downloaded around a thousand times a month by researchers in some sixty countries, which encourages me that well-made open tools find their users.</w:t>
       </w:r>
     </w:p>
     <w:p>

</xml_diff>